<commit_message>
Update Market Trading project brief
</commit_message>
<xml_diff>
--- a/01 Project/Market_Trading.docx
+++ b/01 Project/Market_Trading.docx
@@ -4031,6 +4031,442 @@
       <w:pPr>
         <w:pStyle w:val="Normal"/>
       </w:pPr>
+    </w:p>
+    <w:p>
+      <w:pPr>
+        <w:pStyle w:val="Normal"/>
+      </w:pPr>
+    </w:p>
+    <w:p>
+      <w:pPr>
+        <w:pStyle w:val="Heading1"/>
+        <w:spacing w:before="322" w:beforeAutospacing="off" w:after="322" w:afterAutospacing="off"/>
+      </w:pPr>
+      <w:r>
+        <w:rPr>
+          <w:rFonts w:ascii="Aptos" w:hAnsi="Aptos" w:eastAsia="Aptos" w:cs="Aptos"/>
+          <w:b w:val="1"/>
+          <w:bCs w:val="1"/>
+          <w:noProof w:val="0"/>
+          <w:sz w:val="48"/>
+          <w:szCs w:val="48"/>
+          <w:lang w:val="en-US"/>
+        </w:rPr>
+        <w:t>Alpha Version Roadmap</w:t>
+      </w:r>
+    </w:p>
+    <w:p>
+      <w:pPr>
+        <w:pStyle w:val="Heading2"/>
+        <w:spacing w:before="299" w:beforeAutospacing="off" w:after="299" w:afterAutospacing="off"/>
+      </w:pPr>
+      <w:r>
+        <w:rPr>
+          <w:rFonts w:ascii="Aptos" w:hAnsi="Aptos" w:eastAsia="Aptos" w:cs="Aptos"/>
+          <w:b w:val="1"/>
+          <w:bCs w:val="1"/>
+          <w:noProof w:val="0"/>
+          <w:sz w:val="36"/>
+          <w:szCs w:val="36"/>
+          <w:lang w:val="en-US"/>
+        </w:rPr>
+        <w:t>Alpha 0.1</w:t>
+      </w:r>
+    </w:p>
+    <w:p>
+      <w:pPr>
+        <w:spacing w:before="240" w:beforeAutospacing="off" w:after="240" w:afterAutospacing="off"/>
+      </w:pPr>
+      <w:r>
+        <w:rPr>
+          <w:rFonts w:ascii="Aptos" w:hAnsi="Aptos" w:eastAsia="Aptos" w:cs="Aptos"/>
+          <w:noProof w:val="0"/>
+          <w:sz w:val="24"/>
+          <w:szCs w:val="24"/>
+          <w:lang w:val="en-US"/>
+        </w:rPr>
+        <w:t>Downloads prices</w:t>
+      </w:r>
+    </w:p>
+    <w:p>
+      <w:pPr>
+        <w:spacing w:before="240" w:beforeAutospacing="off" w:after="240" w:afterAutospacing="off"/>
+      </w:pPr>
+      <w:r>
+        <w:rPr>
+          <w:rFonts w:ascii="Aptos" w:hAnsi="Aptos" w:eastAsia="Aptos" w:cs="Aptos"/>
+          <w:noProof w:val="0"/>
+          <w:sz w:val="24"/>
+          <w:szCs w:val="24"/>
+          <w:lang w:val="en-US"/>
+        </w:rPr>
+        <w:t>Plots charts</w:t>
+      </w:r>
+    </w:p>
+    <w:p>
+      <w:pPr>
+        <w:spacing w:before="240" w:beforeAutospacing="off" w:after="240" w:afterAutospacing="off"/>
+      </w:pPr>
+      <w:r>
+        <w:rPr>
+          <w:rFonts w:ascii="Aptos" w:hAnsi="Aptos" w:eastAsia="Aptos" w:cs="Aptos"/>
+          <w:noProof w:val="0"/>
+          <w:sz w:val="24"/>
+          <w:szCs w:val="24"/>
+          <w:lang w:val="en-US"/>
+        </w:rPr>
+        <w:t>Calculates moving averages</w:t>
+      </w:r>
+    </w:p>
+    <w:p/>
+    <w:p>
+      <w:pPr>
+        <w:pStyle w:val="Heading2"/>
+        <w:spacing w:before="299" w:beforeAutospacing="off" w:after="299" w:afterAutospacing="off"/>
+      </w:pPr>
+      <w:r>
+        <w:rPr>
+          <w:rFonts w:ascii="Aptos" w:hAnsi="Aptos" w:eastAsia="Aptos" w:cs="Aptos"/>
+          <w:b w:val="1"/>
+          <w:bCs w:val="1"/>
+          <w:noProof w:val="0"/>
+          <w:sz w:val="36"/>
+          <w:szCs w:val="36"/>
+          <w:lang w:val="en-US"/>
+        </w:rPr>
+        <w:t>Alpha 0.2</w:t>
+      </w:r>
+    </w:p>
+    <w:p>
+      <w:pPr>
+        <w:spacing w:before="240" w:beforeAutospacing="off" w:after="240" w:afterAutospacing="off"/>
+      </w:pPr>
+      <w:r>
+        <w:rPr>
+          <w:rFonts w:ascii="Aptos" w:hAnsi="Aptos" w:eastAsia="Aptos" w:cs="Aptos"/>
+          <w:noProof w:val="0"/>
+          <w:sz w:val="24"/>
+          <w:szCs w:val="24"/>
+          <w:lang w:val="en-US"/>
+        </w:rPr>
+        <w:t>Finds trends</w:t>
+      </w:r>
+    </w:p>
+    <w:p>
+      <w:pPr>
+        <w:spacing w:before="240" w:beforeAutospacing="off" w:after="240" w:afterAutospacing="off"/>
+      </w:pPr>
+      <w:r>
+        <w:rPr>
+          <w:rFonts w:ascii="Aptos" w:hAnsi="Aptos" w:eastAsia="Aptos" w:cs="Aptos"/>
+          <w:noProof w:val="0"/>
+          <w:sz w:val="24"/>
+          <w:szCs w:val="24"/>
+          <w:lang w:val="en-US"/>
+        </w:rPr>
+        <w:t>Calculates momentum</w:t>
+      </w:r>
+    </w:p>
+    <w:p>
+      <w:pPr>
+        <w:spacing w:before="240" w:beforeAutospacing="off" w:after="240" w:afterAutospacing="off"/>
+      </w:pPr>
+      <w:r>
+        <w:rPr>
+          <w:rFonts w:ascii="Aptos" w:hAnsi="Aptos" w:eastAsia="Aptos" w:cs="Aptos"/>
+          <w:noProof w:val="0"/>
+          <w:sz w:val="24"/>
+          <w:szCs w:val="24"/>
+          <w:lang w:val="en-US"/>
+        </w:rPr>
+        <w:t>Creates watchlists</w:t>
+      </w:r>
+    </w:p>
+    <w:p/>
+    <w:p>
+      <w:pPr>
+        <w:pStyle w:val="Heading2"/>
+        <w:spacing w:before="299" w:beforeAutospacing="off" w:after="299" w:afterAutospacing="off"/>
+      </w:pPr>
+      <w:r>
+        <w:rPr>
+          <w:rFonts w:ascii="Aptos" w:hAnsi="Aptos" w:eastAsia="Aptos" w:cs="Aptos"/>
+          <w:b w:val="1"/>
+          <w:bCs w:val="1"/>
+          <w:noProof w:val="0"/>
+          <w:sz w:val="36"/>
+          <w:szCs w:val="36"/>
+          <w:lang w:val="en-US"/>
+        </w:rPr>
+        <w:t>Alpha 0.3</w:t>
+      </w:r>
+    </w:p>
+    <w:p>
+      <w:pPr>
+        <w:spacing w:before="240" w:beforeAutospacing="off" w:after="240" w:afterAutospacing="off"/>
+      </w:pPr>
+      <w:r>
+        <w:rPr>
+          <w:rFonts w:ascii="Aptos" w:hAnsi="Aptos" w:eastAsia="Aptos" w:cs="Aptos"/>
+          <w:noProof w:val="0"/>
+          <w:sz w:val="24"/>
+          <w:szCs w:val="24"/>
+          <w:lang w:val="en-US"/>
+        </w:rPr>
+        <w:t>Scores opportunities</w:t>
+      </w:r>
+    </w:p>
+    <w:p>
+      <w:pPr>
+        <w:spacing w:before="240" w:beforeAutospacing="off" w:after="240" w:afterAutospacing="off"/>
+      </w:pPr>
+      <w:r>
+        <w:rPr>
+          <w:rFonts w:ascii="Aptos" w:hAnsi="Aptos" w:eastAsia="Aptos" w:cs="Aptos"/>
+          <w:noProof w:val="0"/>
+          <w:sz w:val="24"/>
+          <w:szCs w:val="24"/>
+          <w:lang w:val="en-US"/>
+        </w:rPr>
+        <w:t>Ranks stocks</w:t>
+      </w:r>
+    </w:p>
+    <w:p>
+      <w:pPr>
+        <w:spacing w:before="240" w:beforeAutospacing="off" w:after="240" w:afterAutospacing="off"/>
+      </w:pPr>
+      <w:r>
+        <w:rPr>
+          <w:rFonts w:ascii="Aptos" w:hAnsi="Aptos" w:eastAsia="Aptos" w:cs="Aptos"/>
+          <w:noProof w:val="0"/>
+          <w:sz w:val="24"/>
+          <w:szCs w:val="24"/>
+          <w:lang w:val="en-US"/>
+        </w:rPr>
+        <w:t>Produces reports</w:t>
+      </w:r>
+    </w:p>
+    <w:p/>
+    <w:p>
+      <w:pPr>
+        <w:pStyle w:val="Heading2"/>
+        <w:spacing w:before="299" w:beforeAutospacing="off" w:after="299" w:afterAutospacing="off"/>
+      </w:pPr>
+      <w:r>
+        <w:rPr>
+          <w:rFonts w:ascii="Aptos" w:hAnsi="Aptos" w:eastAsia="Aptos" w:cs="Aptos"/>
+          <w:b w:val="1"/>
+          <w:bCs w:val="1"/>
+          <w:noProof w:val="0"/>
+          <w:sz w:val="36"/>
+          <w:szCs w:val="36"/>
+          <w:lang w:val="en-US"/>
+        </w:rPr>
+        <w:t>Alpha 0.4</w:t>
+      </w:r>
+    </w:p>
+    <w:p>
+      <w:pPr>
+        <w:spacing w:before="240" w:beforeAutospacing="off" w:after="240" w:afterAutospacing="off"/>
+      </w:pPr>
+      <w:r>
+        <w:rPr>
+          <w:rFonts w:ascii="Aptos" w:hAnsi="Aptos" w:eastAsia="Aptos" w:cs="Aptos"/>
+          <w:noProof w:val="0"/>
+          <w:sz w:val="24"/>
+          <w:szCs w:val="24"/>
+          <w:lang w:val="en-US"/>
+        </w:rPr>
+        <w:t>Backtests strategies</w:t>
+      </w:r>
+    </w:p>
+    <w:p>
+      <w:pPr>
+        <w:spacing w:before="240" w:beforeAutospacing="off" w:after="240" w:afterAutospacing="off"/>
+      </w:pPr>
+      <w:r>
+        <w:rPr>
+          <w:rFonts w:ascii="Aptos" w:hAnsi="Aptos" w:eastAsia="Aptos" w:cs="Aptos"/>
+          <w:noProof w:val="0"/>
+          <w:sz w:val="24"/>
+          <w:szCs w:val="24"/>
+          <w:lang w:val="en-US"/>
+        </w:rPr>
+        <w:t>Generates statistics</w:t>
+      </w:r>
+    </w:p>
+    <w:p>
+      <w:pPr>
+        <w:spacing w:before="240" w:beforeAutospacing="off" w:after="240" w:afterAutospacing="off"/>
+      </w:pPr>
+      <w:r>
+        <w:rPr>
+          <w:rFonts w:ascii="Aptos" w:hAnsi="Aptos" w:eastAsia="Aptos" w:cs="Aptos"/>
+          <w:noProof w:val="0"/>
+          <w:sz w:val="24"/>
+          <w:szCs w:val="24"/>
+          <w:lang w:val="en-US"/>
+        </w:rPr>
+        <w:t>Measures performance</w:t>
+      </w:r>
+    </w:p>
+    <w:p/>
+    <w:p>
+      <w:pPr>
+        <w:pStyle w:val="Heading2"/>
+        <w:spacing w:before="299" w:beforeAutospacing="off" w:after="299" w:afterAutospacing="off"/>
+      </w:pPr>
+      <w:r>
+        <w:rPr>
+          <w:rFonts w:ascii="Aptos" w:hAnsi="Aptos" w:eastAsia="Aptos" w:cs="Aptos"/>
+          <w:b w:val="1"/>
+          <w:bCs w:val="1"/>
+          <w:noProof w:val="0"/>
+          <w:sz w:val="36"/>
+          <w:szCs w:val="36"/>
+          <w:lang w:val="en-US"/>
+        </w:rPr>
+        <w:t>Alpha 0.5</w:t>
+      </w:r>
+    </w:p>
+    <w:p>
+      <w:pPr>
+        <w:spacing w:before="240" w:beforeAutospacing="off" w:after="240" w:afterAutospacing="off"/>
+      </w:pPr>
+      <w:r>
+        <w:rPr>
+          <w:rFonts w:ascii="Aptos" w:hAnsi="Aptos" w:eastAsia="Aptos" w:cs="Aptos"/>
+          <w:noProof w:val="0"/>
+          <w:sz w:val="24"/>
+          <w:szCs w:val="24"/>
+          <w:lang w:val="en-US"/>
+        </w:rPr>
+        <w:t>Portfolio management</w:t>
+      </w:r>
+    </w:p>
+    <w:p>
+      <w:pPr>
+        <w:spacing w:before="240" w:beforeAutospacing="off" w:after="240" w:afterAutospacing="off"/>
+      </w:pPr>
+      <w:r>
+        <w:rPr>
+          <w:rFonts w:ascii="Aptos" w:hAnsi="Aptos" w:eastAsia="Aptos" w:cs="Aptos"/>
+          <w:noProof w:val="0"/>
+          <w:sz w:val="24"/>
+          <w:szCs w:val="24"/>
+          <w:lang w:val="en-US"/>
+        </w:rPr>
+        <w:t>Risk management</w:t>
+      </w:r>
+    </w:p>
+    <w:p>
+      <w:pPr>
+        <w:spacing w:before="240" w:beforeAutospacing="off" w:after="240" w:afterAutospacing="off"/>
+      </w:pPr>
+      <w:r>
+        <w:rPr>
+          <w:rFonts w:ascii="Aptos" w:hAnsi="Aptos" w:eastAsia="Aptos" w:cs="Aptos"/>
+          <w:noProof w:val="0"/>
+          <w:sz w:val="24"/>
+          <w:szCs w:val="24"/>
+          <w:lang w:val="en-US"/>
+        </w:rPr>
+        <w:t>Trade journal</w:t>
+      </w:r>
+    </w:p>
+    <w:p/>
+    <w:p>
+      <w:pPr>
+        <w:pStyle w:val="Heading2"/>
+        <w:spacing w:before="299" w:beforeAutospacing="off" w:after="299" w:afterAutospacing="off"/>
+      </w:pPr>
+      <w:r>
+        <w:rPr>
+          <w:rFonts w:ascii="Aptos" w:hAnsi="Aptos" w:eastAsia="Aptos" w:cs="Aptos"/>
+          <w:b w:val="1"/>
+          <w:bCs w:val="1"/>
+          <w:noProof w:val="0"/>
+          <w:sz w:val="36"/>
+          <w:szCs w:val="36"/>
+          <w:lang w:val="en-US"/>
+        </w:rPr>
+        <w:t>Alpha 1.0</w:t>
+      </w:r>
+    </w:p>
+    <w:p>
+      <w:pPr>
+        <w:spacing w:before="240" w:beforeAutospacing="off" w:after="240" w:afterAutospacing="off"/>
+      </w:pPr>
+      <w:r>
+        <w:rPr>
+          <w:rFonts w:ascii="Aptos" w:hAnsi="Aptos" w:eastAsia="Aptos" w:cs="Aptos"/>
+          <w:noProof w:val="0"/>
+          <w:sz w:val="24"/>
+          <w:szCs w:val="24"/>
+          <w:lang w:val="en-US"/>
+        </w:rPr>
+        <w:t>Daily scanner</w:t>
+      </w:r>
+    </w:p>
+    <w:p>
+      <w:pPr>
+        <w:spacing w:before="240" w:beforeAutospacing="off" w:after="240" w:afterAutospacing="off"/>
+      </w:pPr>
+      <w:r>
+        <w:rPr>
+          <w:rFonts w:ascii="Aptos" w:hAnsi="Aptos" w:eastAsia="Aptos" w:cs="Aptos"/>
+          <w:noProof w:val="0"/>
+          <w:sz w:val="24"/>
+          <w:szCs w:val="24"/>
+          <w:lang w:val="en-US"/>
+        </w:rPr>
+        <w:t>Dashboard</w:t>
+      </w:r>
+    </w:p>
+    <w:p>
+      <w:pPr>
+        <w:spacing w:before="240" w:beforeAutospacing="off" w:after="240" w:afterAutospacing="off"/>
+      </w:pPr>
+      <w:r>
+        <w:rPr>
+          <w:rFonts w:ascii="Aptos" w:hAnsi="Aptos" w:eastAsia="Aptos" w:cs="Aptos"/>
+          <w:noProof w:val="0"/>
+          <w:sz w:val="24"/>
+          <w:szCs w:val="24"/>
+          <w:lang w:val="en-US"/>
+        </w:rPr>
+        <w:t>Signal engine</w:t>
+      </w:r>
+    </w:p>
+    <w:p>
+      <w:pPr>
+        <w:spacing w:before="240" w:beforeAutospacing="off" w:after="240" w:afterAutospacing="off"/>
+      </w:pPr>
+      <w:r>
+        <w:rPr>
+          <w:rFonts w:ascii="Aptos" w:hAnsi="Aptos" w:eastAsia="Aptos" w:cs="Aptos"/>
+          <w:noProof w:val="0"/>
+          <w:sz w:val="24"/>
+          <w:szCs w:val="24"/>
+          <w:lang w:val="en-US"/>
+        </w:rPr>
+        <w:t>Paper trading</w:t>
+      </w:r>
+    </w:p>
+    <w:p>
+      <w:pPr>
+        <w:spacing w:before="240" w:beforeAutospacing="off" w:after="240" w:afterAutospacing="off"/>
+      </w:pPr>
+      <w:r>
+        <w:rPr>
+          <w:rFonts w:ascii="Aptos" w:hAnsi="Aptos" w:eastAsia="Aptos" w:cs="Aptos"/>
+          <w:noProof w:val="0"/>
+          <w:sz w:val="24"/>
+          <w:szCs w:val="24"/>
+          <w:lang w:val="en-US"/>
+        </w:rPr>
+        <w:t>Ready for live trading</w:t>
+      </w:r>
     </w:p>
     <w:p>
       <w:pPr>
@@ -6034,7 +6470,7 @@
     <w:name w:val="List Paragraph"/>
     <w:basedOn w:val="Normal"/>
     <w:qFormat/>
-    <w:rsid w:val="6BF398EC"/>
+    <w:rsid w:val="42E60662"/>
     <w:pPr>
       <w:spacing/>
       <w:ind w:left="720"/>

</xml_diff>

<commit_message>
Sprint 9 (lightweight): position sizing calculator and CSV trade journal
</commit_message>
<xml_diff>
--- a/01 Project/Market_Trading.docx
+++ b/01 Project/Market_Trading.docx
@@ -1,6 +1,6 @@
 
 <file path=word/document.xml><?xml version="1.0" encoding="utf-8"?>
-<w:document xmlns:wpc="http://schemas.microsoft.com/office/word/2010/wordprocessingCanvas" xmlns:mc="http://schemas.openxmlformats.org/markup-compatibility/2006" xmlns:o="urn:schemas-microsoft-com:office:office" xmlns:r="http://schemas.openxmlformats.org/officeDocument/2006/relationships" xmlns:m="http://schemas.openxmlformats.org/officeDocument/2006/math" xmlns:v="urn:schemas-microsoft-com:vml" xmlns:wp14="http://schemas.microsoft.com/office/word/2010/wordprocessingDrawing" xmlns:wp="http://schemas.openxmlformats.org/drawingml/2006/wordprocessingDrawing" xmlns:w10="urn:schemas-microsoft-com:office:word" xmlns:w="http://schemas.openxmlformats.org/wordprocessingml/2006/main" xmlns:w14="http://schemas.microsoft.com/office/word/2010/wordml" xmlns:w15="http://schemas.microsoft.com/office/word/2012/wordml" xmlns:wpg="http://schemas.microsoft.com/office/word/2010/wordprocessingGroup" xmlns:wpi="http://schemas.microsoft.com/office/word/2010/wordprocessingInk" xmlns:wne="http://schemas.microsoft.com/office/word/2006/wordml" xmlns:wps="http://schemas.microsoft.com/office/word/2010/wordprocessingShape" xmlns:w16se="http://schemas.microsoft.com/office/word/2015/wordml/symex" xmlns:w16cid="http://schemas.microsoft.com/office/word/2016/wordml/cid" xmlns:w16="http://schemas.microsoft.com/office/word/2018/wordml" xmlns:w16cex="http://schemas.microsoft.com/office/word/2018/wordml/cex" xmlns:w16sdtdh="http://schemas.microsoft.com/office/word/2020/wordml/sdtdatahash" xmlns:w16sdtfl="http://schemas.microsoft.com/office/word/2024/wordml/sdtformatlock" mc:Ignorable="w14 w15 wp14 w16se w16cid w16 w16cex w16sdtdh w16sdtfl">
+<w:document xmlns:wpc="http://schemas.microsoft.com/office/word/2010/wordprocessingCanvas" xmlns:mc="http://schemas.openxmlformats.org/markup-compatibility/2006" xmlns:o="urn:schemas-microsoft-com:office:office" xmlns:r="http://schemas.openxmlformats.org/officeDocument/2006/relationships" xmlns:m="http://schemas.openxmlformats.org/officeDocument/2006/math" xmlns:v="urn:schemas-microsoft-com:vml" xmlns:wp14="http://schemas.microsoft.com/office/word/2010/wordprocessingDrawing" xmlns:wp="http://schemas.openxmlformats.org/drawingml/2006/wordprocessingDrawing" xmlns:w10="urn:schemas-microsoft-com:office:word" xmlns:w="http://schemas.openxmlformats.org/wordprocessingml/2006/main" xmlns:w14="http://schemas.microsoft.com/office/word/2010/wordml" xmlns:w15="http://schemas.microsoft.com/office/word/2012/wordml" xmlns:wpg="http://schemas.microsoft.com/office/word/2010/wordprocessingGroup" xmlns:wpi="http://schemas.microsoft.com/office/word/2010/wordprocessingInk" xmlns:wne="http://schemas.microsoft.com/office/word/2006/wordml" xmlns:wps="http://schemas.microsoft.com/office/word/2010/wordprocessingShape" xmlns:w16se="http://schemas.microsoft.com/office/word/2015/wordml/symex" xmlns:w16cid="http://schemas.microsoft.com/office/word/2016/wordml/cid" xmlns:w16="http://schemas.microsoft.com/office/word/2018/wordml" xmlns:w16cex="http://schemas.microsoft.com/office/word/2018/wordml/cex" xmlns:w16sdtdh="http://schemas.microsoft.com/office/word/2020/wordml/sdtdatahash" xmlns:w16sdtfl="http://schemas.microsoft.com/office/word/2024/wordml/sdtformatlock" xmlns:a="http://schemas.openxmlformats.org/drawingml/2006/main" xmlns:pic="http://schemas.openxmlformats.org/drawingml/2006/picture" xmlns:a14="http://schemas.microsoft.com/office/drawing/2010/main" xmlns:woe="http://schemas.microsoft.com/office/word/2020/oembed" mc:Ignorable="w14 w15 wp14 w16se w16cid w16 w16cex w16sdtdh w16sdtfl">
   <w:body>
     <w:p>
       <w:pPr>
@@ -4472,6 +4472,1247 @@
       <w:pPr>
         <w:pStyle w:val="Normal"/>
       </w:pPr>
+    </w:p>
+    <w:p>
+      <w:pPr>
+        <w:pStyle w:val="Heading1"/>
+        <w:spacing w:before="322" w:beforeAutospacing="off" w:after="322" w:afterAutospacing="off"/>
+      </w:pPr>
+      <w:r>
+        <w:rPr>
+          <w:rFonts w:ascii="Aptos" w:hAnsi="Aptos" w:eastAsia="Aptos" w:cs="Aptos"/>
+          <w:b w:val="1"/>
+          <w:bCs w:val="1"/>
+          <w:noProof w:val="0"/>
+          <w:sz w:val="48"/>
+          <w:szCs w:val="48"/>
+          <w:lang w:val="en-US"/>
+        </w:rPr>
+        <w:t>Eventually...</w:t>
+      </w:r>
+    </w:p>
+    <w:p>
+      <w:pPr>
+        <w:spacing w:before="240" w:beforeAutospacing="off" w:after="240" w:afterAutospacing="off"/>
+      </w:pPr>
+      <w:r>
+        <w:rPr>
+          <w:rFonts w:ascii="Aptos" w:hAnsi="Aptos" w:eastAsia="Aptos" w:cs="Aptos"/>
+          <w:noProof w:val="0"/>
+          <w:sz w:val="24"/>
+          <w:szCs w:val="24"/>
+          <w:lang w:val="en-US"/>
+        </w:rPr>
+        <w:t>I'd like Alpha to manage the paper portfolio automatically.</w:t>
+      </w:r>
+    </w:p>
+    <w:p>
+      <w:pPr>
+        <w:spacing w:before="240" w:beforeAutospacing="off" w:after="240" w:afterAutospacing="off"/>
+      </w:pPr>
+      <w:r>
+        <w:rPr>
+          <w:rFonts w:ascii="Aptos" w:hAnsi="Aptos" w:eastAsia="Aptos" w:cs="Aptos"/>
+          <w:noProof w:val="0"/>
+          <w:sz w:val="24"/>
+          <w:szCs w:val="24"/>
+          <w:lang w:val="en-US"/>
+        </w:rPr>
+        <w:t xml:space="preserve">When you press </w:t>
+      </w:r>
+      <w:r>
+        <w:rPr>
+          <w:rFonts w:ascii="Aptos" w:hAnsi="Aptos" w:eastAsia="Aptos" w:cs="Aptos"/>
+          <w:b w:val="1"/>
+          <w:bCs w:val="1"/>
+          <w:noProof w:val="0"/>
+          <w:sz w:val="24"/>
+          <w:szCs w:val="24"/>
+          <w:lang w:val="en-US"/>
+        </w:rPr>
+        <w:t>Run</w:t>
+      </w:r>
+      <w:r>
+        <w:rPr>
+          <w:rFonts w:ascii="Aptos" w:hAnsi="Aptos" w:eastAsia="Aptos" w:cs="Aptos"/>
+          <w:noProof w:val="0"/>
+          <w:sz w:val="24"/>
+          <w:szCs w:val="24"/>
+          <w:lang w:val="en-US"/>
+        </w:rPr>
+        <w:t>, it would:</w:t>
+      </w:r>
+    </w:p>
+    <w:p>
+      <w:pPr>
+        <w:pStyle w:val="ListParagraph"/>
+        <w:numPr>
+          <w:ilvl w:val="0"/>
+          <w:numId w:val="15"/>
+        </w:numPr>
+        <w:spacing w:before="0" w:beforeAutospacing="off" w:after="0" w:afterAutospacing="off"/>
+        <w:rPr>
+          <w:rFonts w:ascii="Aptos" w:hAnsi="Aptos" w:eastAsia="Aptos" w:cs="Aptos"/>
+          <w:noProof w:val="0"/>
+          <w:sz w:val="24"/>
+          <w:szCs w:val="24"/>
+          <w:lang w:val="en-US"/>
+        </w:rPr>
+      </w:pPr>
+      <w:r>
+        <w:rPr>
+          <w:rFonts w:ascii="Aptos" w:hAnsi="Aptos" w:eastAsia="Aptos" w:cs="Aptos"/>
+          <w:noProof w:val="0"/>
+          <w:sz w:val="24"/>
+          <w:szCs w:val="24"/>
+          <w:lang w:val="en-US"/>
+        </w:rPr>
+        <w:t xml:space="preserve">Download the latest prices </w:t>
+      </w:r>
+    </w:p>
+    <w:p>
+      <w:pPr>
+        <w:pStyle w:val="ListParagraph"/>
+        <w:numPr>
+          <w:ilvl w:val="0"/>
+          <w:numId w:val="15"/>
+        </w:numPr>
+        <w:spacing w:before="0" w:beforeAutospacing="off" w:after="0" w:afterAutospacing="off"/>
+        <w:rPr>
+          <w:rFonts w:ascii="Aptos" w:hAnsi="Aptos" w:eastAsia="Aptos" w:cs="Aptos"/>
+          <w:noProof w:val="0"/>
+          <w:sz w:val="24"/>
+          <w:szCs w:val="24"/>
+          <w:lang w:val="en-US"/>
+        </w:rPr>
+      </w:pPr>
+      <w:r>
+        <w:rPr>
+          <w:rFonts w:ascii="Aptos" w:hAnsi="Aptos" w:eastAsia="Aptos" w:cs="Aptos"/>
+          <w:noProof w:val="0"/>
+          <w:sz w:val="24"/>
+          <w:szCs w:val="24"/>
+          <w:lang w:val="en-US"/>
+        </w:rPr>
+        <w:t xml:space="preserve">Generate signals </w:t>
+      </w:r>
+    </w:p>
+    <w:p>
+      <w:pPr>
+        <w:pStyle w:val="ListParagraph"/>
+        <w:numPr>
+          <w:ilvl w:val="0"/>
+          <w:numId w:val="15"/>
+        </w:numPr>
+        <w:spacing w:before="0" w:beforeAutospacing="off" w:after="0" w:afterAutospacing="off"/>
+        <w:rPr>
+          <w:rFonts w:ascii="Aptos" w:hAnsi="Aptos" w:eastAsia="Aptos" w:cs="Aptos"/>
+          <w:noProof w:val="0"/>
+          <w:sz w:val="24"/>
+          <w:szCs w:val="24"/>
+          <w:lang w:val="en-US"/>
+        </w:rPr>
+      </w:pPr>
+      <w:r>
+        <w:rPr>
+          <w:rFonts w:ascii="Aptos" w:hAnsi="Aptos" w:eastAsia="Aptos" w:cs="Aptos"/>
+          <w:noProof w:val="0"/>
+          <w:sz w:val="24"/>
+          <w:szCs w:val="24"/>
+          <w:lang w:val="en-US"/>
+        </w:rPr>
+        <w:t xml:space="preserve">Update existing positions </w:t>
+      </w:r>
+    </w:p>
+    <w:p>
+      <w:pPr>
+        <w:pStyle w:val="ListParagraph"/>
+        <w:numPr>
+          <w:ilvl w:val="0"/>
+          <w:numId w:val="15"/>
+        </w:numPr>
+        <w:spacing w:before="0" w:beforeAutospacing="off" w:after="0" w:afterAutospacing="off"/>
+        <w:rPr>
+          <w:rFonts w:ascii="Aptos" w:hAnsi="Aptos" w:eastAsia="Aptos" w:cs="Aptos"/>
+          <w:noProof w:val="0"/>
+          <w:sz w:val="24"/>
+          <w:szCs w:val="24"/>
+          <w:lang w:val="en-US"/>
+        </w:rPr>
+      </w:pPr>
+      <w:r>
+        <w:rPr>
+          <w:rFonts w:ascii="Aptos" w:hAnsi="Aptos" w:eastAsia="Aptos" w:cs="Aptos"/>
+          <w:noProof w:val="0"/>
+          <w:sz w:val="24"/>
+          <w:szCs w:val="24"/>
+          <w:lang w:val="en-US"/>
+        </w:rPr>
+        <w:t xml:space="preserve">Calculate current profit and loss </w:t>
+      </w:r>
+    </w:p>
+    <w:p>
+      <w:pPr>
+        <w:pStyle w:val="ListParagraph"/>
+        <w:numPr>
+          <w:ilvl w:val="0"/>
+          <w:numId w:val="15"/>
+        </w:numPr>
+        <w:spacing w:before="0" w:beforeAutospacing="off" w:after="0" w:afterAutospacing="off"/>
+        <w:rPr>
+          <w:rFonts w:ascii="Aptos" w:hAnsi="Aptos" w:eastAsia="Aptos" w:cs="Aptos"/>
+          <w:noProof w:val="0"/>
+          <w:sz w:val="24"/>
+          <w:szCs w:val="24"/>
+          <w:lang w:val="en-US"/>
+        </w:rPr>
+      </w:pPr>
+      <w:r>
+        <w:rPr>
+          <w:rFonts w:ascii="Aptos" w:hAnsi="Aptos" w:eastAsia="Aptos" w:cs="Aptos"/>
+          <w:noProof w:val="0"/>
+          <w:sz w:val="24"/>
+          <w:szCs w:val="24"/>
+          <w:lang w:val="en-US"/>
+        </w:rPr>
+        <w:t xml:space="preserve">Show today's trades </w:t>
+      </w:r>
+    </w:p>
+    <w:p>
+      <w:pPr>
+        <w:pStyle w:val="ListParagraph"/>
+        <w:numPr>
+          <w:ilvl w:val="0"/>
+          <w:numId w:val="15"/>
+        </w:numPr>
+        <w:spacing w:before="0" w:beforeAutospacing="off" w:after="0" w:afterAutospacing="off"/>
+        <w:rPr>
+          <w:rFonts w:ascii="Aptos" w:hAnsi="Aptos" w:eastAsia="Aptos" w:cs="Aptos"/>
+          <w:noProof w:val="0"/>
+          <w:sz w:val="24"/>
+          <w:szCs w:val="24"/>
+          <w:lang w:val="en-US"/>
+        </w:rPr>
+      </w:pPr>
+      <w:r>
+        <w:rPr>
+          <w:rFonts w:ascii="Aptos" w:hAnsi="Aptos" w:eastAsia="Aptos" w:cs="Aptos"/>
+          <w:noProof w:val="0"/>
+          <w:sz w:val="24"/>
+          <w:szCs w:val="24"/>
+          <w:lang w:val="en-US"/>
+        </w:rPr>
+        <w:t xml:space="preserve">Track cash </w:t>
+      </w:r>
+    </w:p>
+    <w:p>
+      <w:pPr>
+        <w:pStyle w:val="ListParagraph"/>
+        <w:numPr>
+          <w:ilvl w:val="0"/>
+          <w:numId w:val="15"/>
+        </w:numPr>
+        <w:spacing w:before="0" w:beforeAutospacing="off" w:after="0" w:afterAutospacing="off"/>
+        <w:rPr>
+          <w:rFonts w:ascii="Aptos" w:hAnsi="Aptos" w:eastAsia="Aptos" w:cs="Aptos"/>
+          <w:noProof w:val="0"/>
+          <w:sz w:val="24"/>
+          <w:szCs w:val="24"/>
+          <w:lang w:val="en-US"/>
+        </w:rPr>
+      </w:pPr>
+      <w:r>
+        <w:rPr>
+          <w:rFonts w:ascii="Aptos" w:hAnsi="Aptos" w:eastAsia="Aptos" w:cs="Aptos"/>
+          <w:noProof w:val="0"/>
+          <w:sz w:val="24"/>
+          <w:szCs w:val="24"/>
+          <w:lang w:val="en-US"/>
+        </w:rPr>
+        <w:t xml:space="preserve">Produce performance statistics </w:t>
+      </w:r>
+    </w:p>
+    <w:p>
+      <w:pPr>
+        <w:spacing w:before="240" w:beforeAutospacing="off" w:after="240" w:afterAutospacing="off"/>
+      </w:pPr>
+      <w:r>
+        <w:rPr>
+          <w:rFonts w:ascii="Aptos" w:hAnsi="Aptos" w:eastAsia="Aptos" w:cs="Aptos"/>
+          <w:noProof w:val="0"/>
+          <w:sz w:val="24"/>
+          <w:szCs w:val="24"/>
+          <w:lang w:val="en-US"/>
+        </w:rPr>
+        <w:t>The dashboard might look like:</w:t>
+      </w:r>
+    </w:p>
+    <w:p>
+      <w:pPr>
+        <w:spacing w:before="0" w:beforeAutospacing="off" w:after="0" w:afterAutospacing="off"/>
+      </w:pPr>
+      <w:r>
+        <w:rPr>
+          <w:rFonts w:ascii="Consolas" w:hAnsi="Consolas" w:eastAsia="Consolas" w:cs="Consolas"/>
+          <w:noProof w:val="0"/>
+          <w:sz w:val="24"/>
+          <w:szCs w:val="24"/>
+          <w:lang w:val="en-US"/>
+        </w:rPr>
+        <w:t>Portfolio Value     £102,340</w:t>
+      </w:r>
+      <w:r>
+        <w:br/>
+      </w:r>
+      <w:r>
+        <w:br/>
+      </w:r>
+      <w:r>
+        <w:rPr>
+          <w:rFonts w:ascii="Consolas" w:hAnsi="Consolas" w:eastAsia="Consolas" w:cs="Consolas"/>
+          <w:noProof w:val="0"/>
+          <w:sz w:val="24"/>
+          <w:szCs w:val="24"/>
+          <w:lang w:val="en-US"/>
+        </w:rPr>
+        <w:t>Cash                £18,600</w:t>
+      </w:r>
+      <w:r>
+        <w:br/>
+      </w:r>
+      <w:r>
+        <w:br/>
+      </w:r>
+      <w:r>
+        <w:rPr>
+          <w:rFonts w:ascii="Consolas" w:hAnsi="Consolas" w:eastAsia="Consolas" w:cs="Consolas"/>
+          <w:noProof w:val="0"/>
+          <w:sz w:val="24"/>
+          <w:szCs w:val="24"/>
+          <w:lang w:val="en-US"/>
+        </w:rPr>
+        <w:t>Open Positions           8</w:t>
+      </w:r>
+      <w:r>
+        <w:br/>
+      </w:r>
+      <w:r>
+        <w:br/>
+      </w:r>
+      <w:r>
+        <w:rPr>
+          <w:rFonts w:ascii="Consolas" w:hAnsi="Consolas" w:eastAsia="Consolas" w:cs="Consolas"/>
+          <w:noProof w:val="0"/>
+          <w:sz w:val="24"/>
+          <w:szCs w:val="24"/>
+          <w:lang w:val="en-US"/>
+        </w:rPr>
+        <w:t>Today's Trades           2</w:t>
+      </w:r>
+      <w:r>
+        <w:br/>
+      </w:r>
+      <w:r>
+        <w:br/>
+      </w:r>
+      <w:r>
+        <w:rPr>
+          <w:rFonts w:ascii="Consolas" w:hAnsi="Consolas" w:eastAsia="Consolas" w:cs="Consolas"/>
+          <w:noProof w:val="0"/>
+          <w:sz w:val="24"/>
+          <w:szCs w:val="24"/>
+          <w:lang w:val="en-US"/>
+        </w:rPr>
+        <w:t>Risk Used             0.84%</w:t>
+      </w:r>
+      <w:r>
+        <w:br/>
+      </w:r>
+      <w:r>
+        <w:br/>
+      </w:r>
+      <w:r>
+        <w:rPr>
+          <w:rFonts w:ascii="Consolas" w:hAnsi="Consolas" w:eastAsia="Consolas" w:cs="Consolas"/>
+          <w:noProof w:val="0"/>
+          <w:sz w:val="24"/>
+          <w:szCs w:val="24"/>
+          <w:lang w:val="en-US"/>
+        </w:rPr>
+        <w:t>Performance</w:t>
+      </w:r>
+      <w:r>
+        <w:br/>
+      </w:r>
+      <w:r>
+        <w:br/>
+      </w:r>
+      <w:r>
+        <w:rPr>
+          <w:rFonts w:ascii="Consolas" w:hAnsi="Consolas" w:eastAsia="Consolas" w:cs="Consolas"/>
+          <w:noProof w:val="0"/>
+          <w:sz w:val="24"/>
+          <w:szCs w:val="24"/>
+          <w:lang w:val="en-US"/>
+        </w:rPr>
+        <w:t>YTD                  +11.2%</w:t>
+      </w:r>
+      <w:r>
+        <w:br/>
+      </w:r>
+      <w:r>
+        <w:br/>
+      </w:r>
+      <w:r>
+        <w:rPr>
+          <w:rFonts w:ascii="Consolas" w:hAnsi="Consolas" w:eastAsia="Consolas" w:cs="Consolas"/>
+          <w:noProof w:val="0"/>
+          <w:sz w:val="24"/>
+          <w:szCs w:val="24"/>
+          <w:lang w:val="en-US"/>
+        </w:rPr>
+        <w:t>Max Drawdown          -6.4%</w:t>
+      </w:r>
+      <w:r>
+        <w:br/>
+      </w:r>
+      <w:r>
+        <w:br/>
+      </w:r>
+      <w:r>
+        <w:rPr>
+          <w:rFonts w:ascii="Consolas" w:hAnsi="Consolas" w:eastAsia="Consolas" w:cs="Consolas"/>
+          <w:noProof w:val="0"/>
+          <w:sz w:val="24"/>
+          <w:szCs w:val="24"/>
+          <w:lang w:val="en-US"/>
+        </w:rPr>
+        <w:t>Sharpe                1.32</w:t>
+      </w:r>
+    </w:p>
+    <w:p>
+      <w:pPr>
+        <w:spacing w:before="240" w:beforeAutospacing="off" w:after="240" w:afterAutospacing="off"/>
+      </w:pPr>
+      <w:r>
+        <w:rPr>
+          <w:rFonts w:ascii="Aptos" w:hAnsi="Aptos" w:eastAsia="Aptos" w:cs="Aptos"/>
+          <w:noProof w:val="0"/>
+          <w:sz w:val="24"/>
+          <w:szCs w:val="24"/>
+          <w:lang w:val="en-US"/>
+        </w:rPr>
+        <w:t>You would then make one conscious decision:</w:t>
+      </w:r>
+    </w:p>
+    <w:p>
+      <w:pPr>
+        <w:spacing w:before="240" w:beforeAutospacing="off" w:after="240" w:afterAutospacing="off"/>
+      </w:pPr>
+      <w:r>
+        <w:rPr>
+          <w:rFonts w:ascii="Aptos" w:hAnsi="Aptos" w:eastAsia="Aptos" w:cs="Aptos"/>
+          <w:b w:val="1"/>
+          <w:bCs w:val="1"/>
+          <w:noProof w:val="0"/>
+          <w:sz w:val="24"/>
+          <w:szCs w:val="24"/>
+          <w:lang w:val="en-US"/>
+        </w:rPr>
+        <w:t>Do I accept Alpha's recommendations today?</w:t>
+      </w:r>
+    </w:p>
+    <w:p>
+      <w:pPr>
+        <w:pStyle w:val="Normal"/>
+      </w:pPr>
+    </w:p>
+    <w:p>
+      <w:pPr>
+        <w:pStyle w:val="Normal"/>
+      </w:pPr>
+      <w:r>
+        <w:rPr/>
+        <w:t>Diversification of strategies:</w:t>
+      </w:r>
+    </w:p>
+    <w:p>
+      <w:pPr>
+        <w:pStyle w:val="Normal"/>
+      </w:pPr>
+      <w:r>
+        <w:rPr/>
+        <w:t>Exponentially weighted moving average crossovers</w:t>
+      </w:r>
+    </w:p>
+    <w:p>
+      <w:pPr>
+        <w:pStyle w:val="Normal"/>
+      </w:pPr>
+      <w:r>
+        <w:rPr/>
+        <w:t>Maximum, minimum, average</w:t>
+      </w:r>
+    </w:p>
+    <w:p>
+      <w:pPr>
+        <w:pStyle w:val="Normal"/>
+      </w:pPr>
+      <w:r>
+        <w:rPr/>
+        <w:t>Breakout signals</w:t>
+      </w:r>
+    </w:p>
+    <w:p>
+      <w:pPr>
+        <w:pStyle w:val="Normal"/>
+      </w:pPr>
+      <w:r>
+        <w:rPr/>
+        <w:t>First x minutes of trading each day / week / month?</w:t>
+      </w:r>
+    </w:p>
+    <w:p>
+      <w:pPr>
+        <w:pStyle w:val="Normal"/>
+        <w:rPr>
+          <w:rFonts w:ascii="Aptos" w:hAnsi="Aptos" w:eastAsia="Aptos" w:cs="Aptos"/>
+          <w:noProof w:val="0"/>
+          <w:sz w:val="24"/>
+          <w:szCs w:val="24"/>
+          <w:lang w:val="en-US"/>
+        </w:rPr>
+      </w:pPr>
+      <w:hyperlink r:id="R592a25353ebd4038">
+        <w:r>
+          <w:rPr>
+            <w:rStyle w:val="Hyperlink"/>
+            <w:noProof w:val="0"/>
+            <w:lang w:val="en-US"/>
+          </w:rPr>
+          <w:t>100 Free Trading Strategies (Backtested)</w:t>
+        </w:r>
+      </w:hyperlink>
+    </w:p>
+    <w:p>
+      <w:pPr>
+        <w:pStyle w:val="Normal"/>
+      </w:pPr>
+    </w:p>
+    <w:p>
+      <w:pPr>
+        <w:pStyle w:val="Normal"/>
+      </w:pPr>
+      <w:r>
+        <w:rPr/>
+        <w:t>Risk and sizing positions should ALWAYS be left to science even if you use gut instinct on what shares / currencies to trade</w:t>
+      </w:r>
+    </w:p>
+    <w:p>
+      <w:pPr>
+        <w:pStyle w:val="Normal"/>
+      </w:pPr>
+    </w:p>
+    <w:p>
+      <w:pPr>
+        <w:pStyle w:val="Normal"/>
+      </w:pPr>
+      <w:r>
+        <w:rPr/>
+        <w:t>The benefits of market diversification for trend following systems are very high</w:t>
+      </w:r>
+      <w:r>
+        <w:rPr/>
+        <w:t xml:space="preserve"> – more instruments in the review, more profit likely to make</w:t>
+      </w:r>
+    </w:p>
+    <w:p>
+      <w:pPr>
+        <w:pStyle w:val="Normal"/>
+      </w:pPr>
+      <w:r>
+        <w:rPr/>
+        <w:t xml:space="preserve">Some investment companies </w:t>
+      </w:r>
+      <w:r>
+        <w:rPr/>
+        <w:t>write</w:t>
+      </w:r>
+      <w:r>
+        <w:rPr/>
+        <w:t xml:space="preserve"> papers on strategies. Some people look for papers and test them</w:t>
+      </w:r>
+    </w:p>
+    <w:p>
+      <w:pPr>
+        <w:pStyle w:val="Normal"/>
+      </w:pPr>
+      <w:r>
+        <w:rPr/>
+        <w:t xml:space="preserve">Want to understand why a strategy works before committing to it – </w:t>
+      </w:r>
+      <w:r>
+        <w:rPr/>
+        <w:t>who’s</w:t>
+      </w:r>
+      <w:r>
+        <w:rPr/>
+        <w:t xml:space="preserve"> the person on the other side of the trade </w:t>
+      </w:r>
+      <w:r>
+        <w:rPr/>
+        <w:t>who’s</w:t>
+      </w:r>
+      <w:r>
+        <w:rPr/>
+        <w:t xml:space="preserve"> losing money?</w:t>
+      </w:r>
+    </w:p>
+    <w:p>
+      <w:pPr>
+        <w:pStyle w:val="Normal"/>
+      </w:pPr>
+      <w:r>
+        <w:rPr/>
+        <w:t>A new strategy with low correlation to others used might be good even if marginally loss making because it adds diversity which usually adds returns</w:t>
+      </w:r>
+    </w:p>
+    <w:p>
+      <w:pPr>
+        <w:pStyle w:val="Normal"/>
+      </w:pPr>
+      <w:r>
+        <w:rPr/>
+        <w:t>Systematicmoney.org</w:t>
+      </w:r>
+    </w:p>
+    <w:p>
+      <w:pPr>
+        <w:pStyle w:val="Normal"/>
+      </w:pPr>
+      <w:hyperlink r:id="R23590e0dc702475f">
+        <w:r>
+          <w:rPr>
+            <w:rStyle w:val="Hyperlink"/>
+            <w:noProof w:val="0"/>
+            <w:lang w:val="en-US"/>
+          </w:rPr>
+          <w:t>Robert Carver: Robustness, Risk, and Systematic Trading | In The Money by Zerodha Podcast 04</w:t>
+        </w:r>
+      </w:hyperlink>
+    </w:p>
+    <w:p>
+      <w:r>
+        <w:drawing>
+          <wp:anchor distT="0" distB="0" distL="114300" distR="114300" simplePos="0" relativeHeight="251658240" behindDoc="0" locked="0" layoutInCell="1" allowOverlap="1" wp14:editId="2806E1DD" wp14:anchorId="13666B83">
+            <wp:simplePos x="0" y="0"/>
+            <wp:positionH relativeFrom="column">
+              <wp:align>left</wp:align>
+            </wp:positionH>
+            <wp:positionV relativeFrom="paragraph">
+              <wp:posOffset>0</wp:posOffset>
+            </wp:positionV>
+            <wp:extent cx="5776384" cy="3343275"/>
+            <wp:effectExtent l="0" t="0" r="0" b="0"/>
+            <wp:wrapSquare wrapText="bothSides"/>
+            <wp:docPr id="1555916118" name="picture" descr="U,{5caf20d1-2f6c-4b0b-95fe-c09c6740a6a1}{213},12.63425925925926,7.3125" title="Video titled: Robert Carver: Robustness, Risk, and Systematic Trading | In The Money by Zerodha Podcast 04">
+              <a:hlinkClick r:id="Reaef9cea8f584af4"/>
+            </wp:docPr>
+            <wp:cNvGraphicFramePr>
+              <a:graphicFrameLocks noGrp="1" noSelect="1" noChangeAspect="1" noMove="1" noResize="1"/>
+            </wp:cNvGraphicFramePr>
+            <a:graphic>
+              <a:graphicData uri="http://schemas.openxmlformats.org/drawingml/2006/picture">
+                <pic:pic>
+                  <pic:nvPicPr>
+                    <pic:cNvPr id="0" name="picture"/>
+                    <pic:cNvPicPr>
+                      <a:picLocks noGrp="1" noRot="1" noChangeAspect="1" noMove="1" noResize="1" noEditPoints="1" noAdjustHandles="1" noChangeArrowheads="1" noChangeShapeType="1" noCrop="1"/>
+                    </pic:cNvPicPr>
+                  </pic:nvPicPr>
+                  <pic:blipFill>
+                    <a:blip r:embed="R4fb6d2f8de1f4dad">
+                      <a:extLst>
+                        <a:ext xmlns:a="http://schemas.openxmlformats.org/drawingml/2006/main" uri="{28A0092B-C50C-407E-A947-70E740481C1C}">
+                          <a14:useLocalDpi val="0"/>
+                        </a:ext>
+                        <a:ext uri="http://schemas.microsoft.com/office/word/2020/oembed">
+                          <woe:oembed oEmbedUrl="https://www.youtube.com/watch?v=p0znNV4oWe8" mediaType="Video" picLocksAutoForOEmbed="1"/>
+                        </a:ext>
+                      </a:extLst>
+                    </a:blip>
+                    <a:stretch>
+                      <a:fillRect/>
+                    </a:stretch>
+                  </pic:blipFill>
+                  <pic:spPr>
+                    <a:xfrm>
+                      <a:off x="0" y="0"/>
+                      <a:ext cx="5776384" cy="3343275"/>
+                    </a:xfrm>
+                    <a:prstGeom prst="rect">
+                      <a:avLst/>
+                    </a:prstGeom>
+                  </pic:spPr>
+                </pic:pic>
+              </a:graphicData>
+            </a:graphic>
+            <wp14:sizeRelH relativeFrom="page">
+              <wp14:pctWidth>0</wp14:pctWidth>
+            </wp14:sizeRelH>
+            <wp14:sizeRelV relativeFrom="page">
+              <wp14:pctHeight>0</wp14:pctHeight>
+            </wp14:sizeRelV>
+          </wp:anchor>
+        </w:drawing>
+      </w:r>
+    </w:p>
+    <w:p>
+      <w:pPr>
+        <w:pStyle w:val="Normal"/>
+        <w:rPr>
+          <w:noProof w:val="0"/>
+          <w:lang w:val="en-US"/>
+        </w:rPr>
+      </w:pPr>
+    </w:p>
+    <w:p>
+      <w:pPr>
+        <w:pStyle w:val="Normal"/>
+      </w:pPr>
+      <w:hyperlink r:id="Ra4c1b4b343a547d1">
+        <w:r>
+          <w:rPr>
+            <w:rStyle w:val="Hyperlink"/>
+            <w:noProof w:val="0"/>
+            <w:lang w:val="en-US"/>
+          </w:rPr>
+          <w:t>Simplicity in Systematic Trading | Robert Carver</w:t>
+        </w:r>
+      </w:hyperlink>
+    </w:p>
+    <w:p>
+      <w:r>
+        <w:drawing>
+          <wp:anchor distT="0" distB="0" distL="114300" distR="114300" simplePos="0" relativeHeight="251658240" behindDoc="0" locked="0" layoutInCell="1" allowOverlap="1" wp14:editId="14E8379B" wp14:anchorId="4BE64633">
+            <wp:simplePos x="0" y="0"/>
+            <wp:positionH relativeFrom="column">
+              <wp:align>left</wp:align>
+            </wp:positionH>
+            <wp:positionV relativeFrom="paragraph">
+              <wp:posOffset>0</wp:posOffset>
+            </wp:positionV>
+            <wp:extent cx="5776384" cy="3343275"/>
+            <wp:effectExtent l="0" t="0" r="0" b="0"/>
+            <wp:wrapSquare wrapText="bothSides"/>
+            <wp:docPr id="15445256" name="picture" descr="U,{a1cf0b7c-766f-41b9-8a2a-e52325c56768}{4},12.63425925925926,7.3125" title="Video titled: Simplicity in Systematic Trading | Robert Carver">
+              <a:hlinkClick r:id="R79f3c122faf44fa7"/>
+            </wp:docPr>
+            <wp:cNvGraphicFramePr>
+              <a:graphicFrameLocks noGrp="1" noSelect="1" noChangeAspect="1" noMove="1" noResize="1"/>
+            </wp:cNvGraphicFramePr>
+            <a:graphic>
+              <a:graphicData uri="http://schemas.openxmlformats.org/drawingml/2006/picture">
+                <pic:pic>
+                  <pic:nvPicPr>
+                    <pic:cNvPr id="0" name="picture"/>
+                    <pic:cNvPicPr>
+                      <a:picLocks noGrp="1" noRot="1" noChangeAspect="1" noMove="1" noResize="1" noEditPoints="1" noAdjustHandles="1" noChangeArrowheads="1" noChangeShapeType="1" noCrop="1"/>
+                    </pic:cNvPicPr>
+                  </pic:nvPicPr>
+                  <pic:blipFill>
+                    <a:blip r:embed="R678db0bf92b24d31">
+                      <a:extLst>
+                        <a:ext xmlns:a="http://schemas.openxmlformats.org/drawingml/2006/main" uri="{28A0092B-C50C-407E-A947-70E740481C1C}">
+                          <a14:useLocalDpi val="0"/>
+                        </a:ext>
+                        <a:ext uri="http://schemas.microsoft.com/office/word/2020/oembed">
+                          <woe:oembed oEmbedUrl="https://www.youtube.com/watch?v=klwnw3iSRuM&amp;t=13s" mediaType="Video" picLocksAutoForOEmbed="1"/>
+                        </a:ext>
+                      </a:extLst>
+                    </a:blip>
+                    <a:stretch>
+                      <a:fillRect/>
+                    </a:stretch>
+                  </pic:blipFill>
+                  <pic:spPr>
+                    <a:xfrm>
+                      <a:off x="0" y="0"/>
+                      <a:ext cx="5776384" cy="3343275"/>
+                    </a:xfrm>
+                    <a:prstGeom prst="rect">
+                      <a:avLst/>
+                    </a:prstGeom>
+                  </pic:spPr>
+                </pic:pic>
+              </a:graphicData>
+            </a:graphic>
+            <wp14:sizeRelH relativeFrom="page">
+              <wp14:pctWidth>0</wp14:pctWidth>
+            </wp14:sizeRelH>
+            <wp14:sizeRelV relativeFrom="page">
+              <wp14:pctHeight>0</wp14:pctHeight>
+            </wp14:sizeRelV>
+          </wp:anchor>
+        </w:drawing>
+      </w:r>
+    </w:p>
+    <w:p>
+      <w:pPr>
+        <w:pStyle w:val="Normal"/>
+      </w:pPr>
+      <w:hyperlink r:id="R6f5d5fd85776452a">
+        <w:r>
+          <w:rPr>
+            <w:rStyle w:val="Hyperlink"/>
+            <w:noProof w:val="0"/>
+            <w:lang w:val="en-US"/>
+          </w:rPr>
+          <w:t>33,500% RETURN - Mark Minervini's VCP Setup that made him Millions $$$</w:t>
+        </w:r>
+      </w:hyperlink>
+    </w:p>
+    <w:p>
+      <w:pPr/>
+      <w:r>
+        <w:drawing>
+          <wp:anchor distT="0" distB="0" distL="114300" distR="114300" simplePos="0" relativeHeight="251658240" behindDoc="0" locked="0" layoutInCell="1" allowOverlap="1" wp14:editId="67EB6492" wp14:anchorId="3E6B257A">
+            <wp:simplePos x="0" y="0"/>
+            <wp:positionH relativeFrom="column">
+              <wp:align>left</wp:align>
+            </wp:positionH>
+            <wp:positionV relativeFrom="paragraph">
+              <wp:posOffset>0</wp:posOffset>
+            </wp:positionV>
+            <wp:extent cx="5776384" cy="3343275"/>
+            <wp:effectExtent l="0" t="0" r="0" b="0"/>
+            <wp:wrapSquare wrapText="bothSides"/>
+            <wp:docPr id="1920307476" name="picture" descr="U,{a75962aa-79b4-4a51-9c22-2f6f296a6324}{116},12.63425925925926,7.3125" title="Video titled: 33,500% RETURN - Mark Minervini's VCP Setup that made him Millions $$$">
+              <a:hlinkClick r:id="R050efe08d8974560"/>
+            </wp:docPr>
+            <wp:cNvGraphicFramePr>
+              <a:graphicFrameLocks noGrp="1" noSelect="1" noChangeAspect="1" noMove="1" noResize="1"/>
+            </wp:cNvGraphicFramePr>
+            <a:graphic>
+              <a:graphicData uri="http://schemas.openxmlformats.org/drawingml/2006/picture">
+                <pic:pic>
+                  <pic:nvPicPr>
+                    <pic:cNvPr id="0" name="picture"/>
+                    <pic:cNvPicPr>
+                      <a:picLocks noGrp="1" noRot="1" noChangeAspect="1" noMove="1" noResize="1" noEditPoints="1" noAdjustHandles="1" noChangeArrowheads="1" noChangeShapeType="1" noCrop="1"/>
+                    </pic:cNvPicPr>
+                  </pic:nvPicPr>
+                  <pic:blipFill>
+                    <a:blip r:embed="Re6980afd90a940d8">
+                      <a:extLst>
+                        <a:ext xmlns:a="http://schemas.openxmlformats.org/drawingml/2006/main" uri="{28A0092B-C50C-407E-A947-70E740481C1C}">
+                          <a14:useLocalDpi val="0"/>
+                        </a:ext>
+                        <a:ext uri="http://schemas.microsoft.com/office/word/2020/oembed">
+                          <woe:oembed oEmbedUrl="https://www.youtube.com/watch?v=JS4_6gv0PpI" mediaType="Video" picLocksAutoForOEmbed="1"/>
+                        </a:ext>
+                      </a:extLst>
+                    </a:blip>
+                    <a:stretch>
+                      <a:fillRect/>
+                    </a:stretch>
+                  </pic:blipFill>
+                  <pic:spPr>
+                    <a:xfrm>
+                      <a:off x="0" y="0"/>
+                      <a:ext cx="5776384" cy="3343275"/>
+                    </a:xfrm>
+                    <a:prstGeom prst="rect">
+                      <a:avLst/>
+                    </a:prstGeom>
+                  </pic:spPr>
+                </pic:pic>
+              </a:graphicData>
+            </a:graphic>
+            <wp14:sizeRelH relativeFrom="page">
+              <wp14:pctWidth>0</wp14:pctWidth>
+            </wp14:sizeRelH>
+            <wp14:sizeRelV relativeFrom="page">
+              <wp14:pctHeight>0</wp14:pctHeight>
+            </wp14:sizeRelV>
+          </wp:anchor>
+        </w:drawing>
+      </w:r>
+    </w:p>
+    <w:p>
+      <w:pPr>
+        <w:pStyle w:val="Normal"/>
+      </w:pPr>
+      <w:hyperlink r:id="R10e3c4b749c44559">
+        <w:r>
+          <w:rPr>
+            <w:rStyle w:val="Hyperlink"/>
+            <w:noProof w:val="0"/>
+            <w:lang w:val="en-US"/>
+          </w:rPr>
+          <w:t>How to Backtest a Trading Strategy in Python (Step-by-Step Beginner Tutorial)</w:t>
+        </w:r>
+      </w:hyperlink>
+    </w:p>
+    <w:p>
+      <w:pPr/>
+      <w:r>
+        <w:drawing>
+          <wp:anchor distT="0" distB="0" distL="114300" distR="114300" simplePos="0" relativeHeight="251658240" behindDoc="0" locked="0" layoutInCell="1" allowOverlap="1" wp14:editId="11AD895D" wp14:anchorId="40050DFE">
+            <wp:simplePos x="0" y="0"/>
+            <wp:positionH relativeFrom="column">
+              <wp:align>left</wp:align>
+            </wp:positionH>
+            <wp:positionV relativeFrom="paragraph">
+              <wp:posOffset>0</wp:posOffset>
+            </wp:positionV>
+            <wp:extent cx="5776384" cy="3343275"/>
+            <wp:effectExtent l="0" t="0" r="0" b="0"/>
+            <wp:wrapSquare wrapText="bothSides"/>
+            <wp:docPr id="1323350104" name="picture" descr="U,{a75962aa-79b4-4a51-9c22-2f6f296a6324}{187},12.63425925925926,7.3125" title="Video titled: How to Backtest a Trading Strategy in Python (Step-by-Step Beginner Tutorial)">
+              <a:hlinkClick r:id="R35ddf48302cc49b8"/>
+            </wp:docPr>
+            <wp:cNvGraphicFramePr>
+              <a:graphicFrameLocks noGrp="1" noSelect="1" noChangeAspect="1" noMove="1" noResize="1"/>
+            </wp:cNvGraphicFramePr>
+            <a:graphic>
+              <a:graphicData uri="http://schemas.openxmlformats.org/drawingml/2006/picture">
+                <pic:pic>
+                  <pic:nvPicPr>
+                    <pic:cNvPr id="0" name="picture"/>
+                    <pic:cNvPicPr>
+                      <a:picLocks noGrp="1" noRot="1" noChangeAspect="1" noMove="1" noResize="1" noEditPoints="1" noAdjustHandles="1" noChangeArrowheads="1" noChangeShapeType="1" noCrop="1"/>
+                    </pic:cNvPicPr>
+                  </pic:nvPicPr>
+                  <pic:blipFill>
+                    <a:blip r:embed="Rae4246b6fa7a49c1">
+                      <a:extLst>
+                        <a:ext xmlns:a="http://schemas.openxmlformats.org/drawingml/2006/main" uri="{28A0092B-C50C-407E-A947-70E740481C1C}">
+                          <a14:useLocalDpi val="0"/>
+                        </a:ext>
+                        <a:ext uri="http://schemas.microsoft.com/office/word/2020/oembed">
+                          <woe:oembed oEmbedUrl="https://www.youtube.com/watch?v=rGEWOFsnkD8" mediaType="Video" picLocksAutoForOEmbed="1"/>
+                        </a:ext>
+                      </a:extLst>
+                    </a:blip>
+                    <a:stretch>
+                      <a:fillRect/>
+                    </a:stretch>
+                  </pic:blipFill>
+                  <pic:spPr>
+                    <a:xfrm>
+                      <a:off x="0" y="0"/>
+                      <a:ext cx="5776384" cy="3343275"/>
+                    </a:xfrm>
+                    <a:prstGeom prst="rect">
+                      <a:avLst/>
+                    </a:prstGeom>
+                  </pic:spPr>
+                </pic:pic>
+              </a:graphicData>
+            </a:graphic>
+            <wp14:sizeRelH relativeFrom="page">
+              <wp14:pctWidth>0</wp14:pctWidth>
+            </wp14:sizeRelH>
+            <wp14:sizeRelV relativeFrom="page">
+              <wp14:pctHeight>0</wp14:pctHeight>
+            </wp14:sizeRelV>
+          </wp:anchor>
+        </w:drawing>
+      </w:r>
+    </w:p>
+    <w:p>
+      <w:pPr>
+        <w:pStyle w:val="Normal"/>
+        <w:rPr>
+          <w:noProof w:val="0"/>
+          <w:lang w:val="en-US"/>
+        </w:rPr>
+      </w:pPr>
+    </w:p>
+    <w:p>
+      <w:pPr>
+        <w:pStyle w:val="Normal"/>
+      </w:pPr>
+    </w:p>
+    <w:p>
+      <w:pPr>
+        <w:pStyle w:val="Normal"/>
+      </w:pPr>
+    </w:p>
+    <w:p>
+      <w:pPr>
+        <w:pStyle w:val="Normal"/>
+      </w:pPr>
+    </w:p>
+    <w:p>
+      <w:pPr>
+        <w:pStyle w:val="Normal"/>
+      </w:pPr>
+    </w:p>
+    <w:p>
+      <w:pPr>
+        <w:pStyle w:val="Normal"/>
+      </w:pPr>
+    </w:p>
+    <w:p>
+      <w:pPr>
+        <w:pStyle w:val="Normal"/>
+      </w:pPr>
+    </w:p>
+    <w:p>
+      <w:pPr>
+        <w:pStyle w:val="Normal"/>
+      </w:pPr>
+    </w:p>
+    <w:p>
+      <w:pPr>
+        <w:pStyle w:val="Normal"/>
+      </w:pPr>
+    </w:p>
+    <w:p>
+      <w:pPr>
+        <w:pStyle w:val="Normal"/>
+      </w:pPr>
+    </w:p>
+    <w:p>
+      <w:pPr>
+        <w:pStyle w:val="Normal"/>
+      </w:pPr>
+    </w:p>
+    <w:p>
+      <w:pPr>
+        <w:pStyle w:val="Normal"/>
+      </w:pPr>
+    </w:p>
+    <w:p>
+      <w:pPr>
+        <w:pStyle w:val="Normal"/>
+      </w:pPr>
+    </w:p>
+    <w:p>
+      <w:pPr>
+        <w:pStyle w:val="Normal"/>
+      </w:pPr>
+      <w:r>
+        <w:rPr/>
+        <w:t>Swing Trading Strategies</w:t>
+      </w:r>
+      <w:r>
+        <w:drawing>
+          <wp:inline wp14:editId="512059B4" wp14:anchorId="0FF048F2">
+            <wp:extent cx="5943600" cy="4572000"/>
+            <wp:effectExtent l="0" t="0" r="0" b="0"/>
+            <wp:docPr id="1298173329" name="drawing"/>
+            <wp:cNvGraphicFramePr>
+              <a:graphicFrameLocks noChangeAspect="1"/>
+            </wp:cNvGraphicFramePr>
+            <a:graphic>
+              <a:graphicData xmlns:a="http://schemas.openxmlformats.org/drawingml/2006/main" uri="http://schemas.openxmlformats.org/drawingml/2006/picture">
+                <pic:pic xmlns:pic="http://schemas.openxmlformats.org/drawingml/2006/picture">
+                  <pic:nvPicPr>
+                    <pic:cNvPr id="1298173329" name="Picture 1298173329"/>
+                    <pic:cNvPicPr/>
+                  </pic:nvPicPr>
+                  <pic:blipFill>
+                    <a:blip xmlns:r="http://schemas.openxmlformats.org/officeDocument/2006/relationships" r:embed="rId2020426231">
+                      <a:extLst>
+                        <a:ext uri="{28A0092B-C50C-407E-A947-70E740481C1C}">
+                          <a14:useLocalDpi xmlns:a14="http://schemas.microsoft.com/office/drawing/2010/main"/>
+                        </a:ext>
+                      </a:extLst>
+                    </a:blip>
+                    <a:stretch>
+                      <a:fillRect/>
+                    </a:stretch>
+                  </pic:blipFill>
+                  <pic:spPr>
+                    <a:xfrm>
+                      <a:off x="0" y="0"/>
+                      <a:ext cx="5943600" cy="4572000"/>
+                    </a:xfrm>
+                    <a:prstGeom prst="rect">
+                      <a:avLst/>
+                    </a:prstGeom>
+                  </pic:spPr>
+                </pic:pic>
+              </a:graphicData>
+            </a:graphic>
+          </wp:inline>
+        </w:drawing>
+      </w:r>
+      <w:r>
+        <w:drawing>
+          <wp:inline wp14:editId="7C43842F" wp14:anchorId="0F17E5E6">
+            <wp:extent cx="5943600" cy="4133850"/>
+            <wp:effectExtent l="0" t="0" r="0" b="0"/>
+            <wp:docPr id="74989290" name="drawing"/>
+            <wp:cNvGraphicFramePr>
+              <a:graphicFrameLocks noChangeAspect="1"/>
+            </wp:cNvGraphicFramePr>
+            <a:graphic>
+              <a:graphicData xmlns:a="http://schemas.openxmlformats.org/drawingml/2006/main" uri="http://schemas.openxmlformats.org/drawingml/2006/picture">
+                <pic:pic xmlns:pic="http://schemas.openxmlformats.org/drawingml/2006/picture">
+                  <pic:nvPicPr>
+                    <pic:cNvPr id="74989290" name="Picture 74989290"/>
+                    <pic:cNvPicPr/>
+                  </pic:nvPicPr>
+                  <pic:blipFill>
+                    <a:blip xmlns:r="http://schemas.openxmlformats.org/officeDocument/2006/relationships" r:embed="rId1636009236">
+                      <a:extLst>
+                        <a:ext uri="{28A0092B-C50C-407E-A947-70E740481C1C}">
+                          <a14:useLocalDpi xmlns:a14="http://schemas.microsoft.com/office/drawing/2010/main"/>
+                        </a:ext>
+                      </a:extLst>
+                    </a:blip>
+                    <a:stretch>
+                      <a:fillRect/>
+                    </a:stretch>
+                  </pic:blipFill>
+                  <pic:spPr>
+                    <a:xfrm>
+                      <a:off x="0" y="0"/>
+                      <a:ext cx="5943600" cy="4133850"/>
+                    </a:xfrm>
+                    <a:prstGeom prst="rect">
+                      <a:avLst/>
+                    </a:prstGeom>
+                  </pic:spPr>
+                </pic:pic>
+              </a:graphicData>
+            </a:graphic>
+          </wp:inline>
+        </w:drawing>
+      </w:r>
+      <w:r>
+        <w:drawing>
+          <wp:inline wp14:editId="62C4BECE" wp14:anchorId="365525D1">
+            <wp:extent cx="5943600" cy="3295650"/>
+            <wp:effectExtent l="0" t="0" r="0" b="0"/>
+            <wp:docPr id="313500797" name="drawing"/>
+            <wp:cNvGraphicFramePr>
+              <a:graphicFrameLocks noChangeAspect="1"/>
+            </wp:cNvGraphicFramePr>
+            <a:graphic>
+              <a:graphicData xmlns:a="http://schemas.openxmlformats.org/drawingml/2006/main" uri="http://schemas.openxmlformats.org/drawingml/2006/picture">
+                <pic:pic xmlns:pic="http://schemas.openxmlformats.org/drawingml/2006/picture">
+                  <pic:nvPicPr>
+                    <pic:cNvPr id="313500797" name="Picture 313500797"/>
+                    <pic:cNvPicPr/>
+                  </pic:nvPicPr>
+                  <pic:blipFill>
+                    <a:blip xmlns:r="http://schemas.openxmlformats.org/officeDocument/2006/relationships" r:embed="rId1628082901">
+                      <a:extLst>
+                        <a:ext uri="{28A0092B-C50C-407E-A947-70E740481C1C}">
+                          <a14:useLocalDpi xmlns:a14="http://schemas.microsoft.com/office/drawing/2010/main"/>
+                        </a:ext>
+                      </a:extLst>
+                    </a:blip>
+                    <a:stretch>
+                      <a:fillRect/>
+                    </a:stretch>
+                  </pic:blipFill>
+                  <pic:spPr>
+                    <a:xfrm>
+                      <a:off x="0" y="0"/>
+                      <a:ext cx="5943600" cy="3295650"/>
+                    </a:xfrm>
+                    <a:prstGeom prst="rect">
+                      <a:avLst/>
+                    </a:prstGeom>
+                  </pic:spPr>
+                </pic:pic>
+              </a:graphicData>
+            </a:graphic>
+          </wp:inline>
+        </w:drawing>
+      </w:r>
+      <w:r>
+        <w:drawing>
+          <wp:inline wp14:editId="3233E4C8" wp14:anchorId="57AF6C39">
+            <wp:extent cx="5943600" cy="2657475"/>
+            <wp:effectExtent l="0" t="0" r="0" b="0"/>
+            <wp:docPr id="1272156088" name="drawing"/>
+            <wp:cNvGraphicFramePr>
+              <a:graphicFrameLocks noChangeAspect="1"/>
+            </wp:cNvGraphicFramePr>
+            <a:graphic>
+              <a:graphicData xmlns:a="http://schemas.openxmlformats.org/drawingml/2006/main" uri="http://schemas.openxmlformats.org/drawingml/2006/picture">
+                <pic:pic xmlns:pic="http://schemas.openxmlformats.org/drawingml/2006/picture">
+                  <pic:nvPicPr>
+                    <pic:cNvPr id="1272156088" name="Picture 1272156088"/>
+                    <pic:cNvPicPr/>
+                  </pic:nvPicPr>
+                  <pic:blipFill>
+                    <a:blip xmlns:r="http://schemas.openxmlformats.org/officeDocument/2006/relationships" r:embed="rId1382915896">
+                      <a:extLst>
+                        <a:ext uri="{28A0092B-C50C-407E-A947-70E740481C1C}">
+                          <a14:useLocalDpi xmlns:a14="http://schemas.microsoft.com/office/drawing/2010/main"/>
+                        </a:ext>
+                      </a:extLst>
+                    </a:blip>
+                    <a:stretch>
+                      <a:fillRect/>
+                    </a:stretch>
+                  </pic:blipFill>
+                  <pic:spPr>
+                    <a:xfrm>
+                      <a:off x="0" y="0"/>
+                      <a:ext cx="5943600" cy="2657475"/>
+                    </a:xfrm>
+                    <a:prstGeom prst="rect">
+                      <a:avLst/>
+                    </a:prstGeom>
+                  </pic:spPr>
+                </pic:pic>
+              </a:graphicData>
+            </a:graphic>
+          </wp:inline>
+        </w:drawing>
+      </w:r>
+      <w:r>
+        <w:drawing>
+          <wp:inline wp14:editId="7638CD54" wp14:anchorId="6E6A1B84">
+            <wp:extent cx="5943600" cy="3781425"/>
+            <wp:effectExtent l="0" t="0" r="0" b="0"/>
+            <wp:docPr id="641478521" name="drawing"/>
+            <wp:cNvGraphicFramePr>
+              <a:graphicFrameLocks noChangeAspect="1"/>
+            </wp:cNvGraphicFramePr>
+            <a:graphic>
+              <a:graphicData xmlns:a="http://schemas.openxmlformats.org/drawingml/2006/main" uri="http://schemas.openxmlformats.org/drawingml/2006/picture">
+                <pic:pic xmlns:pic="http://schemas.openxmlformats.org/drawingml/2006/picture">
+                  <pic:nvPicPr>
+                    <pic:cNvPr id="641478521" name="Picture 641478521"/>
+                    <pic:cNvPicPr/>
+                  </pic:nvPicPr>
+                  <pic:blipFill>
+                    <a:blip xmlns:r="http://schemas.openxmlformats.org/officeDocument/2006/relationships" r:embed="rId325031630">
+                      <a:extLst>
+                        <a:ext uri="{28A0092B-C50C-407E-A947-70E740481C1C}">
+                          <a14:useLocalDpi xmlns:a14="http://schemas.microsoft.com/office/drawing/2010/main"/>
+                        </a:ext>
+                      </a:extLst>
+                    </a:blip>
+                    <a:stretch>
+                      <a:fillRect/>
+                    </a:stretch>
+                  </pic:blipFill>
+                  <pic:spPr>
+                    <a:xfrm>
+                      <a:off x="0" y="0"/>
+                      <a:ext cx="5943600" cy="3781425"/>
+                    </a:xfrm>
+                    <a:prstGeom prst="rect">
+                      <a:avLst/>
+                    </a:prstGeom>
+                  </pic:spPr>
+                </pic:pic>
+              </a:graphicData>
+            </a:graphic>
+          </wp:inline>
+        </w:drawing>
+      </w:r>
     </w:p>
     <w:sectPr>
       <w:pgSz w:w="12240" w:h="15840" w:orient="portrait"/>
@@ -4485,6 +5726,118 @@
 
 <file path=word/numbering.xml><?xml version="1.0" encoding="utf-8"?>
 <w:numbering xmlns:w="http://schemas.openxmlformats.org/wordprocessingml/2006/main">
+  <w:abstractNum xmlns:w="http://schemas.openxmlformats.org/wordprocessingml/2006/main" w:abstractNumId="15">
+    <w:nsid w:val="1f7b40e5"/>
+    <w:multiLevelType xmlns:w="http://schemas.openxmlformats.org/wordprocessingml/2006/main" w:val="hybridMultilevel"/>
+    <w:lvl xmlns:w="http://schemas.openxmlformats.org/wordprocessingml/2006/main" w:ilvl="0">
+      <w:start w:val="1"/>
+      <w:numFmt w:val="bullet"/>
+      <w:lvlText w:val=""/>
+      <w:lvlJc w:val="left"/>
+      <w:pPr>
+        <w:ind w:left="720" w:hanging="360"/>
+      </w:pPr>
+      <w:rPr>
+        <w:rFonts w:hint="default" w:ascii="Symbol" w:hAnsi="Symbol"/>
+      </w:rPr>
+    </w:lvl>
+    <w:lvl xmlns:w="http://schemas.openxmlformats.org/wordprocessingml/2006/main" w:ilvl="1">
+      <w:start w:val="1"/>
+      <w:numFmt w:val="bullet"/>
+      <w:lvlText w:val="o"/>
+      <w:lvlJc w:val="left"/>
+      <w:pPr>
+        <w:ind w:left="1440" w:hanging="360"/>
+      </w:pPr>
+      <w:rPr>
+        <w:rFonts w:hint="default" w:ascii="Courier New" w:hAnsi="Courier New"/>
+      </w:rPr>
+    </w:lvl>
+    <w:lvl xmlns:w="http://schemas.openxmlformats.org/wordprocessingml/2006/main" w:ilvl="2">
+      <w:start w:val="1"/>
+      <w:numFmt w:val="bullet"/>
+      <w:lvlText w:val=""/>
+      <w:lvlJc w:val="left"/>
+      <w:pPr>
+        <w:ind w:left="2160" w:hanging="360"/>
+      </w:pPr>
+      <w:rPr>
+        <w:rFonts w:hint="default" w:ascii="Wingdings" w:hAnsi="Wingdings"/>
+      </w:rPr>
+    </w:lvl>
+    <w:lvl xmlns:w="http://schemas.openxmlformats.org/wordprocessingml/2006/main" w:ilvl="3">
+      <w:start w:val="1"/>
+      <w:numFmt w:val="bullet"/>
+      <w:lvlText w:val=""/>
+      <w:lvlJc w:val="left"/>
+      <w:pPr>
+        <w:ind w:left="2880" w:hanging="360"/>
+      </w:pPr>
+      <w:rPr>
+        <w:rFonts w:hint="default" w:ascii="Symbol" w:hAnsi="Symbol"/>
+      </w:rPr>
+    </w:lvl>
+    <w:lvl xmlns:w="http://schemas.openxmlformats.org/wordprocessingml/2006/main" w:ilvl="4">
+      <w:start w:val="1"/>
+      <w:numFmt w:val="bullet"/>
+      <w:lvlText w:val="o"/>
+      <w:lvlJc w:val="left"/>
+      <w:pPr>
+        <w:ind w:left="3600" w:hanging="360"/>
+      </w:pPr>
+      <w:rPr>
+        <w:rFonts w:hint="default" w:ascii="Courier New" w:hAnsi="Courier New"/>
+      </w:rPr>
+    </w:lvl>
+    <w:lvl xmlns:w="http://schemas.openxmlformats.org/wordprocessingml/2006/main" w:ilvl="5">
+      <w:start w:val="1"/>
+      <w:numFmt w:val="bullet"/>
+      <w:lvlText w:val=""/>
+      <w:lvlJc w:val="left"/>
+      <w:pPr>
+        <w:ind w:left="4320" w:hanging="360"/>
+      </w:pPr>
+      <w:rPr>
+        <w:rFonts w:hint="default" w:ascii="Wingdings" w:hAnsi="Wingdings"/>
+      </w:rPr>
+    </w:lvl>
+    <w:lvl xmlns:w="http://schemas.openxmlformats.org/wordprocessingml/2006/main" w:ilvl="6">
+      <w:start w:val="1"/>
+      <w:numFmt w:val="bullet"/>
+      <w:lvlText w:val=""/>
+      <w:lvlJc w:val="left"/>
+      <w:pPr>
+        <w:ind w:left="5040" w:hanging="360"/>
+      </w:pPr>
+      <w:rPr>
+        <w:rFonts w:hint="default" w:ascii="Symbol" w:hAnsi="Symbol"/>
+      </w:rPr>
+    </w:lvl>
+    <w:lvl xmlns:w="http://schemas.openxmlformats.org/wordprocessingml/2006/main" w:ilvl="7">
+      <w:start w:val="1"/>
+      <w:numFmt w:val="bullet"/>
+      <w:lvlText w:val="o"/>
+      <w:lvlJc w:val="left"/>
+      <w:pPr>
+        <w:ind w:left="5760" w:hanging="360"/>
+      </w:pPr>
+      <w:rPr>
+        <w:rFonts w:hint="default" w:ascii="Courier New" w:hAnsi="Courier New"/>
+      </w:rPr>
+    </w:lvl>
+    <w:lvl xmlns:w="http://schemas.openxmlformats.org/wordprocessingml/2006/main" w:ilvl="8">
+      <w:start w:val="1"/>
+      <w:numFmt w:val="bullet"/>
+      <w:lvlText w:val=""/>
+      <w:lvlJc w:val="left"/>
+      <w:pPr>
+        <w:ind w:left="6480" w:hanging="360"/>
+      </w:pPr>
+      <w:rPr>
+        <w:rFonts w:hint="default" w:ascii="Wingdings" w:hAnsi="Wingdings"/>
+      </w:rPr>
+    </w:lvl>
+  </w:abstractNum>
   <w:abstractNum xmlns:w="http://schemas.openxmlformats.org/wordprocessingml/2006/main" w:abstractNumId="14">
     <w:nsid w:val="7e50329"/>
     <w:multiLevelType xmlns:w="http://schemas.openxmlformats.org/wordprocessingml/2006/main" w:val="hybridMultilevel"/>
@@ -5999,6 +7352,9 @@
       </w:rPr>
     </w:lvl>
   </w:abstractNum>
+  <w:num w:numId="15">
+    <w:abstractNumId w:val="15"/>
+  </w:num>
   <w:num w:numId="14">
     <w:abstractNumId w:val="14"/>
   </w:num>
@@ -6470,109 +7826,84 @@
     <w:name w:val="List Paragraph"/>
     <w:basedOn w:val="Normal"/>
     <w:qFormat/>
-    <w:rsid w:val="42E60662"/>
+    <w:rsid w:val="361EDE26"/>
     <w:pPr>
       <w:spacing/>
       <w:ind w:left="720"/>
       <w:contextualSpacing/>
     </w:pPr>
   </w:style>
-  <w:style xmlns:w14="http://schemas.microsoft.com/office/word/2010/wordml" xmlns:mc="http://schemas.openxmlformats.org/markup-compatibility/2006" xmlns:w="http://schemas.openxmlformats.org/wordprocessingml/2006/main" w:type="character" w:styleId="Heading1Char" w:customStyle="1" mc:Ignorable="w14">
-    <w:name xmlns:w="http://schemas.openxmlformats.org/wordprocessingml/2006/main" w:val="Heading 1 Char"/>
-    <w:basedOn xmlns:w="http://schemas.openxmlformats.org/wordprocessingml/2006/main" w:val="DefaultParagraphFont"/>
-    <w:link xmlns:w="http://schemas.openxmlformats.org/wordprocessingml/2006/main" w:val="Heading1"/>
-    <w:uiPriority xmlns:w="http://schemas.openxmlformats.org/wordprocessingml/2006/main" w:val="9"/>
-    <w:rPr xmlns:w="http://schemas.openxmlformats.org/wordprocessingml/2006/main">
-      <w:rFonts w:asciiTheme="majorHAnsi" w:hAnsiTheme="majorHAnsi" w:eastAsiaTheme="majorEastAsia" w:cstheme="majorBidi"/>
-      <w:color w:val="0F4761" w:themeColor="accent1" w:themeShade="BF"/>
+  <w:style w:type="paragraph" w:styleId="Heading1">
+    <w:uiPriority w:val="9"/>
+    <w:name w:val="heading 1"/>
+    <w:basedOn w:val="Normal"/>
+    <w:next w:val="Normal"/>
+    <w:qFormat/>
+    <w:rsid w:val="361EDE26"/>
+    <w:rPr>
+      <w:rFonts w:ascii="Aptos Display" w:hAnsi="Aptos Display" w:eastAsia="" w:cs="" w:asciiTheme="majorAscii" w:hAnsiTheme="majorAscii" w:eastAsiaTheme="majorEastAsia" w:cstheme="majorBidi"/>
+      <w:color w:val="0F4761" w:themeColor="accent1" w:themeTint="FF" w:themeShade="BF"/>
       <w:sz w:val="40"/>
       <w:szCs w:val="40"/>
     </w:rPr>
+    <w:pPr>
+      <w:keepNext w:val="1"/>
+      <w:keepLines w:val="1"/>
+      <w:spacing w:before="360" w:after="80"/>
+      <w:outlineLvl w:val="0"/>
+    </w:pPr>
   </w:style>
-  <w:style xmlns:w14="http://schemas.microsoft.com/office/word/2010/wordml" xmlns:mc="http://schemas.openxmlformats.org/markup-compatibility/2006" xmlns:w="http://schemas.openxmlformats.org/wordprocessingml/2006/main" w:type="paragraph" w:styleId="Heading1" mc:Ignorable="w14">
-    <w:name xmlns:w="http://schemas.openxmlformats.org/wordprocessingml/2006/main" w:val="heading 1"/>
-    <w:basedOn xmlns:w="http://schemas.openxmlformats.org/wordprocessingml/2006/main" w:val="Normal"/>
-    <w:next xmlns:w="http://schemas.openxmlformats.org/wordprocessingml/2006/main" w:val="Normal"/>
-    <w:link xmlns:w="http://schemas.openxmlformats.org/wordprocessingml/2006/main" w:val="Heading1Char"/>
-    <w:uiPriority xmlns:w="http://schemas.openxmlformats.org/wordprocessingml/2006/main" w:val="9"/>
-    <w:qFormat xmlns:w="http://schemas.openxmlformats.org/wordprocessingml/2006/main"/>
-    <w:pPr xmlns:w="http://schemas.openxmlformats.org/wordprocessingml/2006/main">
-      <w:keepNext xmlns:w="http://schemas.openxmlformats.org/wordprocessingml/2006/main"/>
-      <w:keepLines xmlns:w="http://schemas.openxmlformats.org/wordprocessingml/2006/main"/>
-      <w:spacing xmlns:w="http://schemas.openxmlformats.org/wordprocessingml/2006/main" w:before="360" w:after="80"/>
-      <w:outlineLvl xmlns:w="http://schemas.openxmlformats.org/wordprocessingml/2006/main" w:val="0"/>
-    </w:pPr>
-    <w:rPr xmlns:w="http://schemas.openxmlformats.org/wordprocessingml/2006/main">
-      <w:rFonts w:asciiTheme="majorHAnsi" w:hAnsiTheme="majorHAnsi" w:eastAsiaTheme="majorEastAsia" w:cstheme="majorBidi"/>
-      <w:color w:val="0F4761" w:themeColor="accent1" w:themeShade="BF"/>
-      <w:sz w:val="40"/>
-      <w:szCs w:val="40"/>
-    </w:rPr>
-  </w:style>
-  <w:style xmlns:w14="http://schemas.microsoft.com/office/word/2010/wordml" xmlns:mc="http://schemas.openxmlformats.org/markup-compatibility/2006" xmlns:w="http://schemas.openxmlformats.org/wordprocessingml/2006/main" w:type="character" w:styleId="Heading2Char" w:customStyle="1" mc:Ignorable="w14">
-    <w:name xmlns:w="http://schemas.openxmlformats.org/wordprocessingml/2006/main" w:val="Heading 2 Char"/>
-    <w:basedOn xmlns:w="http://schemas.openxmlformats.org/wordprocessingml/2006/main" w:val="DefaultParagraphFont"/>
-    <w:link xmlns:w="http://schemas.openxmlformats.org/wordprocessingml/2006/main" w:val="Heading2"/>
-    <w:uiPriority xmlns:w="http://schemas.openxmlformats.org/wordprocessingml/2006/main" w:val="9"/>
-    <w:rPr xmlns:w="http://schemas.openxmlformats.org/wordprocessingml/2006/main">
-      <w:rFonts w:asciiTheme="majorHAnsi" w:hAnsiTheme="majorHAnsi" w:eastAsiaTheme="majorEastAsia" w:cstheme="majorBidi"/>
-      <w:color w:val="0F4761" w:themeColor="accent1" w:themeShade="BF"/>
+  <w:style w:type="paragraph" w:styleId="Heading2">
+    <w:uiPriority w:val="9"/>
+    <w:name w:val="heading 2"/>
+    <w:basedOn w:val="Normal"/>
+    <w:next w:val="Normal"/>
+    <w:unhideWhenUsed/>
+    <w:qFormat/>
+    <w:rsid w:val="361EDE26"/>
+    <w:rPr>
+      <w:rFonts w:ascii="Aptos Display" w:hAnsi="Aptos Display" w:eastAsia="" w:cs="" w:asciiTheme="majorAscii" w:hAnsiTheme="majorAscii" w:eastAsiaTheme="majorEastAsia" w:cstheme="majorBidi"/>
+      <w:color w:val="0F4761" w:themeColor="accent1" w:themeTint="FF" w:themeShade="BF"/>
       <w:sz w:val="32"/>
       <w:szCs w:val="32"/>
     </w:rPr>
+    <w:pPr>
+      <w:keepNext w:val="1"/>
+      <w:keepLines w:val="1"/>
+      <w:spacing w:before="160" w:after="80"/>
+      <w:outlineLvl w:val="1"/>
+    </w:pPr>
   </w:style>
-  <w:style xmlns:w14="http://schemas.microsoft.com/office/word/2010/wordml" xmlns:mc="http://schemas.openxmlformats.org/markup-compatibility/2006" xmlns:w="http://schemas.openxmlformats.org/wordprocessingml/2006/main" w:type="paragraph" w:styleId="Heading2" mc:Ignorable="w14">
-    <w:name xmlns:w="http://schemas.openxmlformats.org/wordprocessingml/2006/main" w:val="heading 2"/>
-    <w:basedOn xmlns:w="http://schemas.openxmlformats.org/wordprocessingml/2006/main" w:val="Normal"/>
-    <w:next xmlns:w="http://schemas.openxmlformats.org/wordprocessingml/2006/main" w:val="Normal"/>
-    <w:link xmlns:w="http://schemas.openxmlformats.org/wordprocessingml/2006/main" w:val="Heading2Char"/>
-    <w:uiPriority xmlns:w="http://schemas.openxmlformats.org/wordprocessingml/2006/main" w:val="9"/>
-    <w:unhideWhenUsed xmlns:w="http://schemas.openxmlformats.org/wordprocessingml/2006/main"/>
-    <w:qFormat xmlns:w="http://schemas.openxmlformats.org/wordprocessingml/2006/main"/>
-    <w:pPr xmlns:w="http://schemas.openxmlformats.org/wordprocessingml/2006/main">
-      <w:keepNext xmlns:w="http://schemas.openxmlformats.org/wordprocessingml/2006/main"/>
-      <w:keepLines xmlns:w="http://schemas.openxmlformats.org/wordprocessingml/2006/main"/>
-      <w:spacing xmlns:w="http://schemas.openxmlformats.org/wordprocessingml/2006/main" w:before="160" w:after="80"/>
-      <w:outlineLvl xmlns:w="http://schemas.openxmlformats.org/wordprocessingml/2006/main" w:val="1"/>
-    </w:pPr>
-    <w:rPr xmlns:w="http://schemas.openxmlformats.org/wordprocessingml/2006/main">
-      <w:rFonts w:asciiTheme="majorHAnsi" w:hAnsiTheme="majorHAnsi" w:eastAsiaTheme="majorEastAsia" w:cstheme="majorBidi"/>
-      <w:color w:val="0F4761" w:themeColor="accent1" w:themeShade="BF"/>
-      <w:sz w:val="32"/>
-      <w:szCs w:val="32"/>
-    </w:rPr>
-  </w:style>
-  <w:style xmlns:w14="http://schemas.microsoft.com/office/word/2010/wordml" xmlns:mc="http://schemas.openxmlformats.org/markup-compatibility/2006" xmlns:w="http://schemas.openxmlformats.org/wordprocessingml/2006/main" w:type="character" w:styleId="Heading3Char" w:customStyle="1" mc:Ignorable="w14">
-    <w:name xmlns:w="http://schemas.openxmlformats.org/wordprocessingml/2006/main" w:val="Heading 3 Char"/>
-    <w:basedOn xmlns:w="http://schemas.openxmlformats.org/wordprocessingml/2006/main" w:val="DefaultParagraphFont"/>
-    <w:link xmlns:w="http://schemas.openxmlformats.org/wordprocessingml/2006/main" w:val="Heading3"/>
-    <w:uiPriority xmlns:w="http://schemas.openxmlformats.org/wordprocessingml/2006/main" w:val="9"/>
-    <w:rPr xmlns:w="http://schemas.openxmlformats.org/wordprocessingml/2006/main">
-      <w:rFonts w:eastAsiaTheme="majorEastAsia" w:cstheme="majorBidi"/>
-      <w:color w:val="0F4761" w:themeColor="accent1" w:themeShade="BF"/>
+  <w:style w:type="paragraph" w:styleId="Heading3">
+    <w:uiPriority w:val="9"/>
+    <w:name w:val="heading 3"/>
+    <w:basedOn w:val="Normal"/>
+    <w:next w:val="Normal"/>
+    <w:unhideWhenUsed/>
+    <w:qFormat/>
+    <w:rsid w:val="361EDE26"/>
+    <w:rPr>
+      <w:rFonts w:eastAsia="" w:cs="" w:eastAsiaTheme="majorEastAsia" w:cstheme="majorBidi"/>
+      <w:color w:val="0F4761" w:themeColor="accent1" w:themeTint="FF" w:themeShade="BF"/>
       <w:sz w:val="28"/>
       <w:szCs w:val="28"/>
     </w:rPr>
+    <w:pPr>
+      <w:keepNext w:val="1"/>
+      <w:keepLines w:val="1"/>
+      <w:spacing w:before="160" w:after="80"/>
+      <w:outlineLvl w:val="2"/>
+    </w:pPr>
   </w:style>
-  <w:style xmlns:w14="http://schemas.microsoft.com/office/word/2010/wordml" xmlns:mc="http://schemas.openxmlformats.org/markup-compatibility/2006" xmlns:w="http://schemas.openxmlformats.org/wordprocessingml/2006/main" w:type="paragraph" w:styleId="Heading3" mc:Ignorable="w14">
-    <w:name xmlns:w="http://schemas.openxmlformats.org/wordprocessingml/2006/main" w:val="heading 3"/>
-    <w:basedOn xmlns:w="http://schemas.openxmlformats.org/wordprocessingml/2006/main" w:val="Normal"/>
-    <w:next xmlns:w="http://schemas.openxmlformats.org/wordprocessingml/2006/main" w:val="Normal"/>
-    <w:link xmlns:w="http://schemas.openxmlformats.org/wordprocessingml/2006/main" w:val="Heading3Char"/>
-    <w:uiPriority xmlns:w="http://schemas.openxmlformats.org/wordprocessingml/2006/main" w:val="9"/>
-    <w:unhideWhenUsed xmlns:w="http://schemas.openxmlformats.org/wordprocessingml/2006/main"/>
-    <w:qFormat xmlns:w="http://schemas.openxmlformats.org/wordprocessingml/2006/main"/>
-    <w:pPr xmlns:w="http://schemas.openxmlformats.org/wordprocessingml/2006/main">
-      <w:keepNext xmlns:w="http://schemas.openxmlformats.org/wordprocessingml/2006/main"/>
-      <w:keepLines xmlns:w="http://schemas.openxmlformats.org/wordprocessingml/2006/main"/>
-      <w:spacing xmlns:w="http://schemas.openxmlformats.org/wordprocessingml/2006/main" w:before="160" w:after="80"/>
-      <w:outlineLvl xmlns:w="http://schemas.openxmlformats.org/wordprocessingml/2006/main" w:val="2"/>
-    </w:pPr>
-    <w:rPr xmlns:w="http://schemas.openxmlformats.org/wordprocessingml/2006/main">
-      <w:rFonts w:eastAsiaTheme="majorEastAsia" w:cstheme="majorBidi"/>
-      <w:color w:val="0F4761" w:themeColor="accent1" w:themeShade="BF"/>
-      <w:sz w:val="28"/>
-      <w:szCs w:val="28"/>
+  <w:style w:type="character" w:styleId="Hyperlink">
+    <w:uiPriority w:val="99"/>
+    <w:name w:val="Hyperlink"/>
+    <w:basedOn w:val="DefaultParagraphFont"/>
+    <w:unhideWhenUsed/>
+    <w:rsid w:val="361EDE26"/>
+    <w:rPr>
+      <w:color w:val="467886"/>
+      <w:u w:val="single"/>
     </w:rPr>
   </w:style>
 </w:styles>

</xml_diff>